<commit_message>
feat: redap ultra-specification - per-sector fields (FIDE) & hybrid photo upload
</commit_message>
<xml_diff>
--- a/Relatórios_Fide/Relatório do Desastre - Agropecuária.docx
+++ b/Relatórios_Fide/Relatório do Desastre - Agropecuária.docx
@@ -92,8 +92,6 @@
         </w:rPr>
         <w:t>1.1 Identificação</w:t>
       </w:r>
-      <w:bookmarkStart w:id="0" w:name="_GoBack"/>
-      <w:bookmarkEnd w:id="0"/>
     </w:p>
     <w:p>
       <w:pPr>
@@ -708,6 +706,18 @@
                 <w:lang w:val="pt-BR" w:eastAsia="zh-CN" w:bidi="hi-IN"/>
               </w:rPr>
             </w:pPr>
+            <w:r>
+              <w:rPr>
+                <w:rFonts w:hint="default" w:ascii="Arial" w:hAnsi="Arial" w:cs="Arial"/>
+                <w:b/>
+                <w:color w:val="auto"/>
+                <w:sz w:val="24"/>
+                <w:szCs w:val="24"/>
+                <w:vertAlign w:val="baseline"/>
+                <w:lang w:val="pt-BR" w:eastAsia="zh-CN" w:bidi="hi-IN"/>
+              </w:rPr>
+              <w:t>0</w:t>
+            </w:r>
           </w:p>
         </w:tc>
         <w:tc>
@@ -726,6 +736,18 @@
                 <w:lang w:val="pt-BR" w:eastAsia="zh-CN" w:bidi="hi-IN"/>
               </w:rPr>
             </w:pPr>
+            <w:r>
+              <w:rPr>
+                <w:rFonts w:hint="default" w:ascii="Arial" w:hAnsi="Arial" w:cs="Arial"/>
+                <w:b/>
+                <w:color w:val="auto"/>
+                <w:sz w:val="24"/>
+                <w:szCs w:val="24"/>
+                <w:vertAlign w:val="baseline"/>
+                <w:lang w:val="pt-BR" w:eastAsia="zh-CN" w:bidi="hi-IN"/>
+              </w:rPr>
+              <w:t>0</w:t>
+            </w:r>
           </w:p>
         </w:tc>
         <w:tc>
@@ -860,6 +882,15 @@
                 <w:lang w:val="pt-BR"/>
               </w:rPr>
             </w:pPr>
+            <w:r>
+              <w:rPr>
+                <w:rFonts w:hint="default" w:ascii="Arial" w:hAnsi="Arial" w:cs="Arial"/>
+                <w:b/>
+                <w:highlight w:val="yellow"/>
+                <w:lang w:val="pt-BR"/>
+              </w:rPr>
+              <w:t>Abrir um imput obrigatório para cada prejuízo lançado</w:t>
+            </w:r>
           </w:p>
         </w:tc>
       </w:tr>
@@ -1088,6 +1119,12 @@
             <w:insideH w:val="single" w:color="auto" w:sz="4" w:space="0"/>
             <w:insideV w:val="single" w:color="auto" w:sz="4" w:space="0"/>
           </w:tblBorders>
+          <w:tblCellMar>
+            <w:top w:w="0" w:type="dxa"/>
+            <w:left w:w="108" w:type="dxa"/>
+            <w:bottom w:w="0" w:type="dxa"/>
+            <w:right w:w="108" w:type="dxa"/>
+          </w:tblCellMar>
         </w:tblPrEx>
         <w:tc>
           <w:tcPr>
@@ -1233,6 +1270,18 @@
                 <w:lang w:val="pt-BR" w:eastAsia="zh-CN" w:bidi="hi-IN"/>
               </w:rPr>
             </w:pPr>
+            <w:r>
+              <w:rPr>
+                <w:rFonts w:hint="default" w:ascii="Arial" w:hAnsi="Arial" w:cs="Arial"/>
+                <w:b/>
+                <w:color w:val="auto"/>
+                <w:sz w:val="24"/>
+                <w:szCs w:val="24"/>
+                <w:vertAlign w:val="baseline"/>
+                <w:lang w:val="pt-BR" w:eastAsia="zh-CN" w:bidi="hi-IN"/>
+              </w:rPr>
+              <w:t>0</w:t>
+            </w:r>
           </w:p>
         </w:tc>
       </w:tr>
@@ -1309,6 +1358,18 @@
                 <w:lang w:val="pt-BR" w:eastAsia="zh-CN" w:bidi="hi-IN"/>
               </w:rPr>
             </w:pPr>
+            <w:r>
+              <w:rPr>
+                <w:rFonts w:hint="default" w:ascii="Arial" w:hAnsi="Arial" w:cs="Arial"/>
+                <w:b/>
+                <w:color w:val="auto"/>
+                <w:sz w:val="24"/>
+                <w:szCs w:val="24"/>
+                <w:vertAlign w:val="baseline"/>
+                <w:lang w:val="pt-BR" w:eastAsia="zh-CN" w:bidi="hi-IN"/>
+              </w:rPr>
+              <w:t>0</w:t>
+            </w:r>
           </w:p>
         </w:tc>
       </w:tr>
@@ -1473,12 +1534,6 @@
             <w:insideH w:val="single" w:color="auto" w:sz="4" w:space="0"/>
             <w:insideV w:val="single" w:color="auto" w:sz="4" w:space="0"/>
           </w:tblBorders>
-          <w:tblCellMar>
-            <w:top w:w="0" w:type="dxa"/>
-            <w:left w:w="108" w:type="dxa"/>
-            <w:bottom w:w="0" w:type="dxa"/>
-            <w:right w:w="108" w:type="dxa"/>
-          </w:tblCellMar>
         </w:tblPrEx>
         <w:tc>
           <w:tcPr>
@@ -1515,6 +1570,29 @@
               <w:rPr>
                 <w:rFonts w:hint="default" w:ascii="Arial" w:hAnsi="Arial" w:cs="Arial"/>
                 <w:b/>
+                <w:highlight w:val="yellow"/>
+                <w:lang w:val="pt-BR"/>
+              </w:rPr>
+            </w:pPr>
+            <w:r>
+              <w:rPr>
+                <w:rFonts w:hint="default" w:ascii="Arial" w:hAnsi="Arial" w:cs="Arial"/>
+                <w:b/>
+                <w:highlight w:val="yellow"/>
+                <w:lang w:val="pt-BR"/>
+              </w:rPr>
+              <w:t>Abrir um imput obrigatório para cada prejuízo lançado</w:t>
+            </w:r>
+          </w:p>
+          <w:p>
+            <w:pPr>
+              <w:pStyle w:val="2"/>
+              <w:bidi w:val="0"/>
+              <w:spacing w:before="0" w:after="283"/>
+              <w:jc w:val="left"/>
+              <w:rPr>
+                <w:rFonts w:hint="default" w:ascii="Arial" w:hAnsi="Arial" w:cs="Arial"/>
+                <w:b/>
                 <w:vertAlign w:val="baseline"/>
                 <w:lang w:val="pt-BR"/>
               </w:rPr>
@@ -1818,7 +1896,142 @@
           <w:szCs w:val="24"/>
           <w:lang w:val="pt-BR" w:eastAsia="zh-CN" w:bidi="hi-IN"/>
         </w:rPr>
+        <w:t>ANEXOS</w:t>
+      </w:r>
+      <w:bookmarkStart w:id="0" w:name="_GoBack"/>
+      <w:bookmarkEnd w:id="0"/>
+    </w:p>
+    <w:p>
+      <w:pPr>
+        <w:widowControl w:val="0"/>
+        <w:numPr>
+          <w:numId w:val="0"/>
+        </w:numPr>
+        <w:suppressAutoHyphens/>
+        <w:kinsoku/>
+        <w:overflowPunct/>
+        <w:autoSpaceDE/>
+        <w:bidi w:val="0"/>
+        <w:ind w:leftChars="0"/>
+        <w:rPr>
+          <w:rFonts w:hint="default" w:ascii="Arial" w:hAnsi="Arial" w:cs="Arial"/>
+          <w:b/>
+          <w:color w:val="auto"/>
+          <w:sz w:val="24"/>
+          <w:szCs w:val="24"/>
+          <w:lang w:val="pt-BR" w:eastAsia="zh-CN" w:bidi="hi-IN"/>
+        </w:rPr>
+      </w:pPr>
+    </w:p>
+    <w:p>
+      <w:pPr>
+        <w:widowControl w:val="0"/>
+        <w:numPr>
+          <w:numId w:val="0"/>
+        </w:numPr>
+        <w:suppressAutoHyphens/>
+        <w:kinsoku/>
+        <w:overflowPunct/>
+        <w:autoSpaceDE/>
+        <w:bidi w:val="0"/>
+        <w:ind w:leftChars="0"/>
+        <w:rPr>
+          <w:rFonts w:hint="default" w:ascii="Arial" w:hAnsi="Arial" w:cs="Arial"/>
+          <w:b/>
+          <w:color w:val="auto"/>
+          <w:sz w:val="24"/>
+          <w:szCs w:val="24"/>
+          <w:lang w:val="pt-BR" w:eastAsia="zh-CN" w:bidi="hi-IN"/>
+        </w:rPr>
+      </w:pPr>
+    </w:p>
+    <w:p>
+      <w:pPr>
+        <w:widowControl w:val="0"/>
+        <w:numPr>
+          <w:numId w:val="0"/>
+        </w:numPr>
+        <w:suppressAutoHyphens/>
+        <w:kinsoku/>
+        <w:overflowPunct/>
+        <w:autoSpaceDE/>
+        <w:bidi w:val="0"/>
+        <w:ind w:leftChars="0"/>
+        <w:rPr>
+          <w:rFonts w:hint="default" w:ascii="Arial" w:hAnsi="Arial" w:cs="Arial"/>
+          <w:b/>
+          <w:color w:val="auto"/>
+          <w:sz w:val="24"/>
+          <w:szCs w:val="24"/>
+          <w:lang w:val="pt-BR" w:eastAsia="zh-CN" w:bidi="hi-IN"/>
+        </w:rPr>
+      </w:pPr>
+    </w:p>
+    <w:p>
+      <w:pPr>
+        <w:widowControl w:val="0"/>
+        <w:numPr>
+          <w:ilvl w:val="0"/>
+          <w:numId w:val="1"/>
+        </w:numPr>
+        <w:suppressAutoHyphens/>
+        <w:kinsoku/>
+        <w:overflowPunct/>
+        <w:autoSpaceDE/>
+        <w:bidi w:val="0"/>
+        <w:ind w:left="0" w:leftChars="0" w:firstLine="0" w:firstLineChars="0"/>
+        <w:rPr>
+          <w:rFonts w:hint="default" w:ascii="Arial" w:hAnsi="Arial" w:cs="Arial"/>
+          <w:b/>
+          <w:color w:val="auto"/>
+          <w:sz w:val="24"/>
+          <w:szCs w:val="24"/>
+          <w:lang w:val="pt-BR" w:eastAsia="zh-CN" w:bidi="hi-IN"/>
+        </w:rPr>
+      </w:pPr>
+      <w:r>
+        <w:rPr>
+          <w:rFonts w:hint="default" w:ascii="Arial" w:hAnsi="Arial" w:cs="Arial"/>
+          <w:b/>
+          <w:color w:val="auto"/>
+          <w:sz w:val="24"/>
+          <w:szCs w:val="24"/>
+          <w:lang w:val="pt-BR" w:eastAsia="zh-CN" w:bidi="hi-IN"/>
+        </w:rPr>
         <w:t>RELATÓRIO FOTOGRÁFICO</w:t>
+      </w:r>
+    </w:p>
+    <w:p>
+      <w:pPr>
+        <w:widowControl w:val="0"/>
+        <w:numPr>
+          <w:numId w:val="0"/>
+        </w:numPr>
+        <w:suppressAutoHyphens/>
+        <w:kinsoku/>
+        <w:overflowPunct/>
+        <w:autoSpaceDE/>
+        <w:bidi w:val="0"/>
+        <w:ind w:leftChars="0"/>
+        <w:rPr>
+          <w:rFonts w:hint="default" w:ascii="Arial" w:hAnsi="Arial" w:cs="Arial"/>
+          <w:b/>
+          <w:color w:val="auto"/>
+          <w:sz w:val="24"/>
+          <w:szCs w:val="24"/>
+          <w:lang w:val="pt-BR" w:eastAsia="zh-CN" w:bidi="hi-IN"/>
+        </w:rPr>
+      </w:pPr>
+      <w:r>
+        <w:rPr>
+          <w:rFonts w:hint="default" w:ascii="Arial" w:hAnsi="Arial" w:cs="Arial"/>
+          <w:b/>
+          <w:color w:val="auto"/>
+          <w:sz w:val="24"/>
+          <w:szCs w:val="24"/>
+          <w:lang w:val="pt-BR" w:eastAsia="zh-CN" w:bidi="hi-IN"/>
+        </w:rPr>
+        <w:t>(deixar obrigatório) (possível checkbox para informar que não teve danos/prejuizo, caso marque, imput obrigatório de texto para justificar a não inclusão de imagens)</w:t>
       </w:r>
     </w:p>
     <w:sectPr>
@@ -1926,8 +2139,8 @@
     <w:lsdException w:qFormat="1" w:unhideWhenUsed="0" w:uiPriority="0" w:semiHidden="0" w:name="Title"/>
     <w:lsdException w:unhideWhenUsed="0" w:uiPriority="0" w:semiHidden="0" w:name="Closing"/>
     <w:lsdException w:unhideWhenUsed="0" w:uiPriority="0" w:semiHidden="0" w:name="Signature"/>
-    <w:lsdException w:unhideWhenUsed="0" w:uiPriority="0" w:name="Default Paragraph Font"/>
-    <w:lsdException w:unhideWhenUsed="0" w:uiPriority="0" w:semiHidden="0" w:name="Body Text"/>
+    <w:lsdException w:qFormat="1" w:unhideWhenUsed="0" w:uiPriority="0" w:name="Default Paragraph Font"/>
+    <w:lsdException w:qFormat="1" w:unhideWhenUsed="0" w:uiPriority="0" w:semiHidden="0" w:name="Body Text"/>
     <w:lsdException w:unhideWhenUsed="0" w:uiPriority="0" w:semiHidden="0" w:name="Body Text Indent"/>
     <w:lsdException w:unhideWhenUsed="0" w:uiPriority="0" w:semiHidden="0" w:name="List Continue"/>
     <w:lsdException w:unhideWhenUsed="0" w:uiPriority="0" w:semiHidden="0" w:name="List Continue 2"/>
@@ -1964,7 +2177,7 @@
     <w:lsdException w:unhideWhenUsed="0" w:uiPriority="0" w:semiHidden="0" w:name="HTML Sample"/>
     <w:lsdException w:unhideWhenUsed="0" w:uiPriority="0" w:semiHidden="0" w:name="HTML Typewriter"/>
     <w:lsdException w:unhideWhenUsed="0" w:uiPriority="0" w:semiHidden="0" w:name="HTML Variable"/>
-    <w:lsdException w:unhideWhenUsed="0" w:uiPriority="0" w:name="Normal Table"/>
+    <w:lsdException w:qFormat="1" w:unhideWhenUsed="0" w:uiPriority="0" w:name="Normal Table"/>
     <w:lsdException w:unhideWhenUsed="0" w:uiPriority="0" w:semiHidden="0" w:name="annotation subject"/>
     <w:lsdException w:unhideWhenUsed="0" w:uiPriority="0" w:semiHidden="0" w:name="Table Simple 1"/>
     <w:lsdException w:unhideWhenUsed="0" w:uiPriority="0" w:semiHidden="0" w:name="Table Simple 2"/>
@@ -2009,7 +2222,7 @@
     <w:lsdException w:unhideWhenUsed="0" w:uiPriority="0" w:semiHidden="0" w:name="Table Web 2"/>
     <w:lsdException w:unhideWhenUsed="0" w:uiPriority="0" w:semiHidden="0" w:name="Table Web 3"/>
     <w:lsdException w:unhideWhenUsed="0" w:uiPriority="0" w:semiHidden="0" w:name="Balloon Text"/>
-    <w:lsdException w:unhideWhenUsed="0" w:uiPriority="0" w:semiHidden="0" w:name="Table Grid"/>
+    <w:lsdException w:qFormat="1" w:unhideWhenUsed="0" w:uiPriority="0" w:semiHidden="0" w:name="Table Grid"/>
     <w:lsdException w:unhideWhenUsed="0" w:uiPriority="0" w:semiHidden="0" w:name="Table Theme"/>
   </w:latentStyles>
   <w:style w:type="paragraph" w:default="1" w:styleId="1">
@@ -2035,11 +2248,13 @@
   <w:style w:type="character" w:default="1" w:styleId="3">
     <w:name w:val="Default Paragraph Font"/>
     <w:semiHidden/>
+    <w:qFormat/>
     <w:uiPriority w:val="0"/>
   </w:style>
   <w:style w:type="table" w:default="1" w:styleId="4">
     <w:name w:val="Normal Table"/>
     <w:semiHidden/>
+    <w:qFormat/>
     <w:uiPriority w:val="0"/>
     <w:tblPr>
       <w:tblCellMar>
@@ -2053,6 +2268,7 @@
   <w:style w:type="paragraph" w:styleId="2">
     <w:name w:val="Body Text"/>
     <w:basedOn w:val="1"/>
+    <w:qFormat/>
     <w:uiPriority w:val="0"/>
     <w:pPr>
       <w:spacing w:before="0" w:after="283"/>
@@ -2061,6 +2277,7 @@
   <w:style w:type="table" w:styleId="5">
     <w:name w:val="Table Grid"/>
     <w:basedOn w:val="4"/>
+    <w:qFormat/>
     <w:uiPriority w:val="0"/>
     <w:tblPr>
       <w:tblBorders>

</xml_diff>